<commit_message>
progress update: fixed text run import mistake added class files to be used later (WIP)
</commit_message>
<xml_diff>
--- a/dummy_mcq.docx
+++ b/dummy_mcq.docx
@@ -551,10 +551,108 @@
     </w:p>
     <w:p>
       <w:pPr>
-        <w:rPr>
-          <w:lang w:val="en-GB"/>
-        </w:rPr>
-      </w:pPr>
+        <w:pStyle w:val="ListParagraph"/>
+        <w:numPr>
+          <w:ilvl w:val="0"/>
+          <w:numId w:val="1"/>
+        </w:numPr>
+        <w:rPr>
+          <w:lang w:val="en-GB"/>
+        </w:rPr>
+      </w:pPr>
+      <w:r>
+        <w:rPr>
+          <w:lang w:val="en-GB"/>
+        </w:rPr>
+        <w:t xml:space="preserve">Is diluted </w:t>
+      </w:r>
+      <m:oMath>
+        <m:r>
+          <w:rPr>
+            <w:rFonts w:ascii="Cambria Math" w:hAnsi="Cambria Math"/>
+            <w:lang w:val="en-GB"/>
+          </w:rPr>
+          <m:t>NaCl(aq)</m:t>
+        </m:r>
+      </m:oMath>
+      <w:r>
+        <w:rPr>
+          <w:lang w:val="en-GB"/>
+        </w:rPr>
+        <w:t xml:space="preserve"> safe to drink? (with the inconvenient way to create &amp; parse)</w:t>
+      </w:r>
+    </w:p>
+    <w:p>
+      <w:pPr>
+        <w:pStyle w:val="ListParagraph"/>
+        <w:numPr>
+          <w:ilvl w:val="0"/>
+          <w:numId w:val="5"/>
+        </w:numPr>
+        <w:rPr>
+          <w:lang w:val="en-GB"/>
+        </w:rPr>
+      </w:pPr>
+      <w:r>
+        <w:rPr>
+          <w:lang w:val="en-GB"/>
+        </w:rPr>
+        <w:t>Yes</w:t>
+      </w:r>
+    </w:p>
+    <w:p>
+      <w:pPr>
+        <w:pStyle w:val="ListParagraph"/>
+        <w:numPr>
+          <w:ilvl w:val="0"/>
+          <w:numId w:val="5"/>
+        </w:numPr>
+        <w:rPr>
+          <w:lang w:val="en-GB"/>
+        </w:rPr>
+      </w:pPr>
+      <w:r>
+        <w:rPr>
+          <w:lang w:val="en-GB"/>
+        </w:rPr>
+        <w:t>No</w:t>
+      </w:r>
+    </w:p>
+    <w:p>
+      <w:pPr>
+        <w:pStyle w:val="ListParagraph"/>
+        <w:numPr>
+          <w:ilvl w:val="0"/>
+          <w:numId w:val="5"/>
+        </w:numPr>
+        <w:rPr>
+          <w:lang w:val="en-GB"/>
+        </w:rPr>
+      </w:pPr>
+      <w:r>
+        <w:rPr>
+          <w:lang w:val="en-GB"/>
+        </w:rPr>
+        <w:t>Maybe</w:t>
+      </w:r>
+    </w:p>
+    <w:p>
+      <w:pPr>
+        <w:pStyle w:val="ListParagraph"/>
+        <w:numPr>
+          <w:ilvl w:val="0"/>
+          <w:numId w:val="5"/>
+        </w:numPr>
+        <w:rPr>
+          <w:lang w:val="en-GB"/>
+        </w:rPr>
+      </w:pPr>
+      <w:r>
+        <w:rPr>
+          <w:lang w:val="en-GB"/>
+        </w:rPr>
+        <w:t>Depends</w:t>
+      </w:r>
     </w:p>
     <w:sectPr>
       <w:type w:val="continuous"/>
@@ -837,6 +935,95 @@
     </w:lvl>
   </w:abstractNum>
   <w:abstractNum w:abstractNumId="3" w15:restartNumberingAfterBreak="0">
+    <w:nsid w:val="5F870C34"/>
+    <w:multiLevelType w:val="hybridMultilevel"/>
+    <w:tmpl w:val="A48622A4"/>
+    <w:lvl w:ilvl="0" w:tplc="F4481D90">
+      <w:start w:val="1"/>
+      <w:numFmt w:val="upperLetter"/>
+      <w:lvlText w:val="%1."/>
+      <w:lvlJc w:val="left"/>
+      <w:pPr>
+        <w:ind w:left="720" w:hanging="360"/>
+      </w:pPr>
+      <w:rPr>
+        <w:rFonts w:hint="default"/>
+      </w:rPr>
+    </w:lvl>
+    <w:lvl w:ilvl="1" w:tplc="04090019" w:tentative="1">
+      <w:start w:val="1"/>
+      <w:numFmt w:val="ideographTraditional"/>
+      <w:lvlText w:val="%2、"/>
+      <w:lvlJc w:val="left"/>
+      <w:pPr>
+        <w:ind w:left="1320" w:hanging="480"/>
+      </w:pPr>
+    </w:lvl>
+    <w:lvl w:ilvl="2" w:tplc="0409001B" w:tentative="1">
+      <w:start w:val="1"/>
+      <w:numFmt w:val="lowerRoman"/>
+      <w:lvlText w:val="%3."/>
+      <w:lvlJc w:val="right"/>
+      <w:pPr>
+        <w:ind w:left="1800" w:hanging="480"/>
+      </w:pPr>
+    </w:lvl>
+    <w:lvl w:ilvl="3" w:tplc="0409000F" w:tentative="1">
+      <w:start w:val="1"/>
+      <w:numFmt w:val="decimal"/>
+      <w:lvlText w:val="%4."/>
+      <w:lvlJc w:val="left"/>
+      <w:pPr>
+        <w:ind w:left="2280" w:hanging="480"/>
+      </w:pPr>
+    </w:lvl>
+    <w:lvl w:ilvl="4" w:tplc="04090019" w:tentative="1">
+      <w:start w:val="1"/>
+      <w:numFmt w:val="ideographTraditional"/>
+      <w:lvlText w:val="%5、"/>
+      <w:lvlJc w:val="left"/>
+      <w:pPr>
+        <w:ind w:left="2760" w:hanging="480"/>
+      </w:pPr>
+    </w:lvl>
+    <w:lvl w:ilvl="5" w:tplc="0409001B" w:tentative="1">
+      <w:start w:val="1"/>
+      <w:numFmt w:val="lowerRoman"/>
+      <w:lvlText w:val="%6."/>
+      <w:lvlJc w:val="right"/>
+      <w:pPr>
+        <w:ind w:left="3240" w:hanging="480"/>
+      </w:pPr>
+    </w:lvl>
+    <w:lvl w:ilvl="6" w:tplc="0409000F" w:tentative="1">
+      <w:start w:val="1"/>
+      <w:numFmt w:val="decimal"/>
+      <w:lvlText w:val="%7."/>
+      <w:lvlJc w:val="left"/>
+      <w:pPr>
+        <w:ind w:left="3720" w:hanging="480"/>
+      </w:pPr>
+    </w:lvl>
+    <w:lvl w:ilvl="7" w:tplc="04090019" w:tentative="1">
+      <w:start w:val="1"/>
+      <w:numFmt w:val="ideographTraditional"/>
+      <w:lvlText w:val="%8、"/>
+      <w:lvlJc w:val="left"/>
+      <w:pPr>
+        <w:ind w:left="4200" w:hanging="480"/>
+      </w:pPr>
+    </w:lvl>
+    <w:lvl w:ilvl="8" w:tplc="0409001B" w:tentative="1">
+      <w:start w:val="1"/>
+      <w:numFmt w:val="lowerRoman"/>
+      <w:lvlText w:val="%9."/>
+      <w:lvlJc w:val="right"/>
+      <w:pPr>
+        <w:ind w:left="4680" w:hanging="480"/>
+      </w:pPr>
+    </w:lvl>
+  </w:abstractNum>
+  <w:abstractNum w:abstractNumId="4" w15:restartNumberingAfterBreak="0">
     <w:nsid w:val="76B55519"/>
     <w:multiLevelType w:val="hybridMultilevel"/>
     <w:tmpl w:val="82A2F19E"/>
@@ -935,6 +1122,9 @@
     <w:abstractNumId w:val="1"/>
   </w:num>
   <w:num w:numId="4" w16cid:durableId="2131701398">
+    <w:abstractNumId w:val="4"/>
+  </w:num>
+  <w:num w:numId="5" w16cid:durableId="241450417">
     <w:abstractNumId w:val="3"/>
   </w:num>
 </w:numbering>

</xml_diff>

<commit_message>
removed duplicate loop; checkpoint before heavy modification to CTR section to accommodate parsing of images (maybe for each paragraph, start with getRuns instead, we're just extracting text atm)
</commit_message>
<xml_diff>
--- a/dummy_mcq.docx
+++ b/dummy_mcq.docx
@@ -654,6 +654,681 @@
         <w:t>Depends</w:t>
       </w:r>
     </w:p>
+    <w:p>
+      <w:pPr>
+        <w:rPr>
+          <w:lang w:val="en-GB"/>
+        </w:rPr>
+      </w:pPr>
+    </w:p>
+    <w:p>
+      <w:pPr>
+        <w:pStyle w:val="ListParagraph"/>
+        <w:numPr>
+          <w:ilvl w:val="0"/>
+          <w:numId w:val="1"/>
+        </w:numPr>
+        <w:rPr>
+          <w:lang w:val="en-GB"/>
+        </w:rPr>
+      </w:pPr>
+      <w:r>
+        <w:rPr>
+          <w:lang w:val="en-GB"/>
+        </w:rPr>
+        <w:t>You’re given the following</w:t>
+      </w:r>
+      <w:r>
+        <w:rPr>
+          <w:lang w:val="en-GB"/>
+        </w:rPr>
+        <w:t xml:space="preserve"> table:</w:t>
+      </w:r>
+    </w:p>
+    <w:tbl>
+      <w:tblPr>
+        <w:tblStyle w:val="TableGrid"/>
+        <w:tblW w:w="0" w:type="auto"/>
+        <w:tblInd w:w="360" w:type="dxa"/>
+        <w:tblLook w:val="0600" w:firstRow="0" w:lastRow="0" w:firstColumn="0" w:lastColumn="0" w:noHBand="1" w:noVBand="1"/>
+      </w:tblPr>
+      <w:tblGrid>
+        <w:gridCol w:w="2881"/>
+        <w:gridCol w:w="2908"/>
+        <w:gridCol w:w="2867"/>
+      </w:tblGrid>
+      <w:tr>
+        <w:tc>
+          <w:tcPr>
+            <w:tcW w:w="3005" w:type="dxa"/>
+          </w:tcPr>
+          <w:p>
+            <w:pPr>
+              <w:rPr>
+                <w:lang w:val="en-GB"/>
+              </w:rPr>
+            </w:pPr>
+            <w:r>
+              <w:rPr>
+                <w:lang w:val="en-GB"/>
+              </w:rPr>
+              <w:t>1</w:t>
+            </w:r>
+          </w:p>
+        </w:tc>
+        <w:tc>
+          <w:tcPr>
+            <w:tcW w:w="3005" w:type="dxa"/>
+          </w:tcPr>
+          <w:p>
+            <w:pPr>
+              <w:rPr>
+                <w:lang w:val="en-GB"/>
+              </w:rPr>
+            </w:pPr>
+            <w:r>
+              <w:rPr>
+                <w:lang w:val="en-GB"/>
+              </w:rPr>
+              <w:t>2</w:t>
+            </w:r>
+          </w:p>
+        </w:tc>
+        <w:tc>
+          <w:tcPr>
+            <w:tcW w:w="3006" w:type="dxa"/>
+          </w:tcPr>
+          <w:p>
+            <w:pPr>
+              <w:rPr>
+                <w:lang w:val="en-GB"/>
+              </w:rPr>
+            </w:pPr>
+            <w:r>
+              <w:rPr>
+                <w:lang w:val="en-GB"/>
+              </w:rPr>
+              <w:t>3.88</w:t>
+            </w:r>
+          </w:p>
+        </w:tc>
+      </w:tr>
+      <w:tr>
+        <w:tc>
+          <w:tcPr>
+            <w:tcW w:w="3005" w:type="dxa"/>
+          </w:tcPr>
+          <w:p>
+            <w:pPr>
+              <w:rPr>
+                <w:lang w:val="en-GB"/>
+              </w:rPr>
+            </w:pPr>
+            <w:r>
+              <w:rPr>
+                <w:lang w:val="en-GB"/>
+              </w:rPr>
+              <w:t>9.81</w:t>
+            </w:r>
+          </w:p>
+        </w:tc>
+        <w:tc>
+          <w:tcPr>
+            <w:tcW w:w="3005" w:type="dxa"/>
+          </w:tcPr>
+          <w:p>
+            <w:pPr>
+              <w:rPr>
+                <w:lang w:val="en-GB"/>
+              </w:rPr>
+            </w:pPr>
+            <w:r>
+              <w:rPr>
+                <w:lang w:val="en-GB"/>
+              </w:rPr>
+              <w:t>299792458</w:t>
+            </w:r>
+          </w:p>
+        </w:tc>
+        <w:tc>
+          <w:tcPr>
+            <w:tcW w:w="3006" w:type="dxa"/>
+          </w:tcPr>
+          <w:p>
+            <w:pPr>
+              <w:rPr>
+                <w:lang w:val="en-GB"/>
+              </w:rPr>
+            </w:pPr>
+            <w:r>
+              <w:rPr>
+                <w:lang w:val="en-GB"/>
+              </w:rPr>
+              <w:t>6.02</w:t>
+            </w:r>
+          </w:p>
+        </w:tc>
+      </w:tr>
+      <w:tr>
+        <w:tc>
+          <w:tcPr>
+            <w:tcW w:w="3005" w:type="dxa"/>
+          </w:tcPr>
+          <w:p>
+            <w:pPr>
+              <w:rPr>
+                <w:lang w:val="en-GB"/>
+              </w:rPr>
+            </w:pPr>
+            <w:r>
+              <w:rPr>
+                <w:lang w:val="en-GB"/>
+              </w:rPr>
+              <w:t>6.6743</w:t>
+            </w:r>
+          </w:p>
+        </w:tc>
+        <w:tc>
+          <w:tcPr>
+            <w:tcW w:w="3005" w:type="dxa"/>
+          </w:tcPr>
+          <w:p>
+            <w:pPr>
+              <w:rPr>
+                <w:lang w:val="en-GB"/>
+              </w:rPr>
+            </w:pPr>
+            <w:r>
+              <w:rPr>
+                <w:lang w:val="en-GB"/>
+              </w:rPr>
+              <w:t>0.0662</w:t>
+            </w:r>
+          </w:p>
+        </w:tc>
+        <w:tc>
+          <w:tcPr>
+            <w:tcW w:w="3006" w:type="dxa"/>
+          </w:tcPr>
+          <w:p>
+            <w:pPr>
+              <w:rPr>
+                <w:lang w:val="en-GB"/>
+              </w:rPr>
+            </w:pPr>
+            <w:r>
+              <w:rPr>
+                <w:lang w:val="en-GB"/>
+              </w:rPr>
+              <w:t>67</w:t>
+            </w:r>
+          </w:p>
+        </w:tc>
+      </w:tr>
+      <w:tr>
+        <w:tc>
+          <w:tcPr>
+            <w:tcW w:w="3005" w:type="dxa"/>
+          </w:tcPr>
+          <w:p>
+            <w:pPr>
+              <w:rPr>
+                <w:lang w:val="en-GB"/>
+              </w:rPr>
+            </w:pPr>
+            <w:r>
+              <w:rPr>
+                <w:lang w:val="en-GB"/>
+              </w:rPr>
+              <w:t>42</w:t>
+            </w:r>
+          </w:p>
+        </w:tc>
+        <w:tc>
+          <w:tcPr>
+            <w:tcW w:w="3005" w:type="dxa"/>
+          </w:tcPr>
+          <w:p>
+            <w:pPr>
+              <w:rPr>
+                <w:lang w:val="en-GB"/>
+              </w:rPr>
+            </w:pPr>
+            <w:r>
+              <w:rPr>
+                <w:lang w:val="en-GB"/>
+              </w:rPr>
+              <w:t>1812</w:t>
+            </w:r>
+          </w:p>
+        </w:tc>
+        <w:tc>
+          <w:tcPr>
+            <w:tcW w:w="3006" w:type="dxa"/>
+          </w:tcPr>
+          <w:p>
+            <w:pPr>
+              <w:rPr>
+                <w:lang w:val="en-GB"/>
+              </w:rPr>
+            </w:pPr>
+            <w:r>
+              <w:rPr>
+                <w:lang w:val="en-GB"/>
+              </w:rPr>
+              <w:t>9.64</w:t>
+            </w:r>
+          </w:p>
+        </w:tc>
+      </w:tr>
+    </w:tbl>
+    <w:p>
+      <w:pPr>
+        <w:pStyle w:val="ListParagraph"/>
+        <w:ind w:left="360"/>
+        <w:rPr>
+          <w:lang w:val="en-GB"/>
+        </w:rPr>
+      </w:pPr>
+      <w:r>
+        <w:rPr>
+          <w:lang w:val="en-GB"/>
+        </w:rPr>
+        <w:t>What is Samuel’s favourite food for breakfast?</w:t>
+      </w:r>
+    </w:p>
+    <w:p>
+      <w:pPr>
+        <w:pStyle w:val="ListParagraph"/>
+        <w:numPr>
+          <w:ilvl w:val="0"/>
+          <w:numId w:val="9"/>
+        </w:numPr>
+        <w:rPr>
+          <w:lang w:val="en-GB"/>
+        </w:rPr>
+      </w:pPr>
+      <w:r>
+        <w:rPr>
+          <w:lang w:val="en-GB"/>
+        </w:rPr>
+        <w:t xml:space="preserve">Jos Louis  </w:t>
+      </w:r>
+      <w:r>
+        <w:rPr>
+          <w:lang w:val="en-GB"/>
+        </w:rPr>
+        <w:t xml:space="preserve">b. Pop tarts  </w:t>
+      </w:r>
+      <w:r>
+        <w:rPr>
+          <w:lang w:val="en-GB"/>
+        </w:rPr>
+        <w:t>c. Deep-fried Mars bar  d. macaroni soup with ham</w:t>
+      </w:r>
+    </w:p>
+    <w:p>
+      <w:pPr>
+        <w:widowControl/>
+        <w:rPr>
+          <w:lang w:val="en-GB"/>
+        </w:rPr>
+      </w:pPr>
+      <w:r>
+        <w:rPr>
+          <w:lang w:val="en-GB"/>
+        </w:rPr>
+        <w:br w:type="page"/>
+      </w:r>
+    </w:p>
+    <w:p>
+      <w:pPr>
+        <w:pStyle w:val="ListParagraph"/>
+        <w:numPr>
+          <w:ilvl w:val="0"/>
+          <w:numId w:val="1"/>
+        </w:numPr>
+        <w:rPr>
+          <w:lang w:val="en-GB"/>
+        </w:rPr>
+      </w:pPr>
+      <w:r>
+        <w:rPr>
+          <w:lang w:val="en-GB"/>
+        </w:rPr>
+        <w:lastRenderedPageBreak/>
+        <w:t>You’re given the following</w:t>
+      </w:r>
+      <w:r>
+        <w:rPr>
+          <w:lang w:val="en-GB"/>
+        </w:rPr>
+        <w:t xml:space="preserve"> image: (preceding page break):</w:t>
+      </w:r>
+      <w:r>
+        <w:rPr>
+          <w:lang w:val="en-GB"/>
+        </w:rPr>
+        <w:drawing>
+          <wp:inline distT="0" distB="0" distL="0" distR="0" wp14:anchorId="35E2DE4E" wp14:editId="5B772ADB">
+            <wp:extent cx="5236029" cy="2887183"/>
+            <wp:effectExtent l="0" t="0" r="3175" b="8890"/>
+            <wp:docPr id="1592722013" name="Picture 1"/>
+            <wp:cNvGraphicFramePr>
+              <a:graphicFrameLocks xmlns:a="http://schemas.openxmlformats.org/drawingml/2006/main" noChangeAspect="1"/>
+            </wp:cNvGraphicFramePr>
+            <a:graphic xmlns:a="http://schemas.openxmlformats.org/drawingml/2006/main">
+              <a:graphicData uri="http://schemas.openxmlformats.org/drawingml/2006/picture">
+                <pic:pic xmlns:pic="http://schemas.openxmlformats.org/drawingml/2006/picture">
+                  <pic:nvPicPr>
+                    <pic:cNvPr id="1592722013" name=""/>
+                    <pic:cNvPicPr/>
+                  </pic:nvPicPr>
+                  <pic:blipFill>
+                    <a:blip r:embed="rId5"/>
+                    <a:stretch>
+                      <a:fillRect/>
+                    </a:stretch>
+                  </pic:blipFill>
+                  <pic:spPr>
+                    <a:xfrm>
+                      <a:off x="0" y="0"/>
+                      <a:ext cx="5243179" cy="2891126"/>
+                    </a:xfrm>
+                    <a:prstGeom prst="rect">
+                      <a:avLst/>
+                    </a:prstGeom>
+                  </pic:spPr>
+                </pic:pic>
+              </a:graphicData>
+            </a:graphic>
+          </wp:inline>
+        </w:drawing>
+      </w:r>
+      <w:r>
+        <w:rPr>
+          <w:lang w:val="en-GB"/>
+        </w:rPr>
+        <w:br/>
+        <w:t>Which of the following is a flask?</w:t>
+      </w:r>
+      <w:r>
+        <w:rPr>
+          <w:lang w:val="en-GB"/>
+        </w:rPr>
+        <w:br/>
+      </w:r>
+      <w:r>
+        <w:rPr>
+          <w:lang w:val="en-GB"/>
+        </w:rPr>
+        <w:t xml:space="preserve">I) </w:t>
+      </w:r>
+      <w:r>
+        <w:rPr>
+          <w:lang w:val="en-GB"/>
+        </w:rPr>
+        <w:drawing>
+          <wp:inline distT="0" distB="0" distL="0" distR="0" wp14:anchorId="142AD6E6" wp14:editId="4A82E37C">
+            <wp:extent cx="930753" cy="1338978"/>
+            <wp:effectExtent l="0" t="0" r="3175" b="0"/>
+            <wp:docPr id="790132090" name="Picture 1"/>
+            <wp:cNvGraphicFramePr>
+              <a:graphicFrameLocks xmlns:a="http://schemas.openxmlformats.org/drawingml/2006/main" noChangeAspect="1"/>
+            </wp:cNvGraphicFramePr>
+            <a:graphic xmlns:a="http://schemas.openxmlformats.org/drawingml/2006/main">
+              <a:graphicData uri="http://schemas.openxmlformats.org/drawingml/2006/picture">
+                <pic:pic xmlns:pic="http://schemas.openxmlformats.org/drawingml/2006/picture">
+                  <pic:nvPicPr>
+                    <pic:cNvPr id="790132090" name=""/>
+                    <pic:cNvPicPr/>
+                  </pic:nvPicPr>
+                  <pic:blipFill>
+                    <a:blip r:embed="rId6"/>
+                    <a:stretch>
+                      <a:fillRect/>
+                    </a:stretch>
+                  </pic:blipFill>
+                  <pic:spPr>
+                    <a:xfrm>
+                      <a:off x="0" y="0"/>
+                      <a:ext cx="930753" cy="1338978"/>
+                    </a:xfrm>
+                    <a:prstGeom prst="rect">
+                      <a:avLst/>
+                    </a:prstGeom>
+                  </pic:spPr>
+                </pic:pic>
+              </a:graphicData>
+            </a:graphic>
+          </wp:inline>
+        </w:drawing>
+      </w:r>
+      <w:r>
+        <w:rPr>
+          <w:lang w:val="en-GB"/>
+        </w:rPr>
+        <w:t xml:space="preserve"> II) </w:t>
+      </w:r>
+      <w:r>
+        <w:rPr>
+          <w:lang w:val="en-GB"/>
+        </w:rPr>
+        <w:drawing>
+          <wp:inline distT="0" distB="0" distL="0" distR="0" wp14:anchorId="54D37A24" wp14:editId="3C9F3F9B">
+            <wp:extent cx="1031413" cy="1305826"/>
+            <wp:effectExtent l="0" t="0" r="0" b="8890"/>
+            <wp:docPr id="57721204" name="Picture 1"/>
+            <wp:cNvGraphicFramePr>
+              <a:graphicFrameLocks xmlns:a="http://schemas.openxmlformats.org/drawingml/2006/main" noChangeAspect="1"/>
+            </wp:cNvGraphicFramePr>
+            <a:graphic xmlns:a="http://schemas.openxmlformats.org/drawingml/2006/main">
+              <a:graphicData uri="http://schemas.openxmlformats.org/drawingml/2006/picture">
+                <pic:pic xmlns:pic="http://schemas.openxmlformats.org/drawingml/2006/picture">
+                  <pic:nvPicPr>
+                    <pic:cNvPr id="57721204" name=""/>
+                    <pic:cNvPicPr/>
+                  </pic:nvPicPr>
+                  <pic:blipFill>
+                    <a:blip r:embed="rId7"/>
+                    <a:stretch>
+                      <a:fillRect/>
+                    </a:stretch>
+                  </pic:blipFill>
+                  <pic:spPr>
+                    <a:xfrm>
+                      <a:off x="0" y="0"/>
+                      <a:ext cx="1037458" cy="1313480"/>
+                    </a:xfrm>
+                    <a:prstGeom prst="rect">
+                      <a:avLst/>
+                    </a:prstGeom>
+                  </pic:spPr>
+                </pic:pic>
+              </a:graphicData>
+            </a:graphic>
+          </wp:inline>
+        </w:drawing>
+      </w:r>
+      <w:r>
+        <w:rPr>
+          <w:lang w:val="en-GB"/>
+        </w:rPr>
+        <w:t xml:space="preserve"> III) </w:t>
+      </w:r>
+      <w:r>
+        <w:rPr>
+          <w:lang w:val="en-GB"/>
+        </w:rPr>
+        <w:drawing>
+          <wp:inline distT="0" distB="0" distL="0" distR="0" wp14:anchorId="17ADB569" wp14:editId="5C8B2233">
+            <wp:extent cx="1159251" cy="1288959"/>
+            <wp:effectExtent l="0" t="0" r="3175" b="6985"/>
+            <wp:docPr id="1664076286" name="Picture 1"/>
+            <wp:cNvGraphicFramePr>
+              <a:graphicFrameLocks xmlns:a="http://schemas.openxmlformats.org/drawingml/2006/main" noChangeAspect="1"/>
+            </wp:cNvGraphicFramePr>
+            <a:graphic xmlns:a="http://schemas.openxmlformats.org/drawingml/2006/main">
+              <a:graphicData uri="http://schemas.openxmlformats.org/drawingml/2006/picture">
+                <pic:pic xmlns:pic="http://schemas.openxmlformats.org/drawingml/2006/picture">
+                  <pic:nvPicPr>
+                    <pic:cNvPr id="1664076286" name=""/>
+                    <pic:cNvPicPr/>
+                  </pic:nvPicPr>
+                  <pic:blipFill>
+                    <a:blip r:embed="rId8"/>
+                    <a:stretch>
+                      <a:fillRect/>
+                    </a:stretch>
+                  </pic:blipFill>
+                  <pic:spPr>
+                    <a:xfrm>
+                      <a:off x="0" y="0"/>
+                      <a:ext cx="1167665" cy="1298315"/>
+                    </a:xfrm>
+                    <a:prstGeom prst="rect">
+                      <a:avLst/>
+                    </a:prstGeom>
+                  </pic:spPr>
+                </pic:pic>
+              </a:graphicData>
+            </a:graphic>
+          </wp:inline>
+        </w:drawing>
+      </w:r>
+      <w:r>
+        <w:rPr>
+          <w:lang w:val="en-GB"/>
+        </w:rPr>
+        <w:t xml:space="preserve"> IV) </w:t>
+      </w:r>
+      <w:r>
+        <w:rPr>
+          <w:lang w:val="en-GB"/>
+        </w:rPr>
+        <w:drawing>
+          <wp:inline distT="0" distB="0" distL="0" distR="0" wp14:anchorId="1C14473D" wp14:editId="4D7DC32A">
+            <wp:extent cx="900039" cy="1392918"/>
+            <wp:effectExtent l="0" t="0" r="0" b="0"/>
+            <wp:docPr id="885387730" name="Picture 1"/>
+            <wp:cNvGraphicFramePr>
+              <a:graphicFrameLocks xmlns:a="http://schemas.openxmlformats.org/drawingml/2006/main" noChangeAspect="1"/>
+            </wp:cNvGraphicFramePr>
+            <a:graphic xmlns:a="http://schemas.openxmlformats.org/drawingml/2006/main">
+              <a:graphicData uri="http://schemas.openxmlformats.org/drawingml/2006/picture">
+                <pic:pic xmlns:pic="http://schemas.openxmlformats.org/drawingml/2006/picture">
+                  <pic:nvPicPr>
+                    <pic:cNvPr id="885387730" name=""/>
+                    <pic:cNvPicPr/>
+                  </pic:nvPicPr>
+                  <pic:blipFill>
+                    <a:blip r:embed="rId9"/>
+                    <a:stretch>
+                      <a:fillRect/>
+                    </a:stretch>
+                  </pic:blipFill>
+                  <pic:spPr>
+                    <a:xfrm>
+                      <a:off x="0" y="0"/>
+                      <a:ext cx="904096" cy="1399197"/>
+                    </a:xfrm>
+                    <a:prstGeom prst="rect">
+                      <a:avLst/>
+                    </a:prstGeom>
+                  </pic:spPr>
+                </pic:pic>
+              </a:graphicData>
+            </a:graphic>
+          </wp:inline>
+        </w:drawing>
+      </w:r>
+    </w:p>
+    <w:p>
+      <w:pPr>
+        <w:jc w:val="center"/>
+        <w:rPr>
+          <w:lang w:val="en-GB"/>
+        </w:rPr>
+      </w:pPr>
+    </w:p>
+    <w:p>
+      <w:pPr>
+        <w:jc w:val="center"/>
+        <w:rPr>
+          <w:lang w:val="en-GB"/>
+        </w:rPr>
+      </w:pPr>
+    </w:p>
+    <w:p>
+      <w:pPr>
+        <w:jc w:val="center"/>
+        <w:rPr>
+          <w:lang w:val="en-GB"/>
+        </w:rPr>
+      </w:pPr>
+    </w:p>
+    <w:p>
+      <w:pPr>
+        <w:jc w:val="center"/>
+        <w:rPr>
+          <w:lang w:val="en-GB"/>
+        </w:rPr>
+      </w:pPr>
+    </w:p>
+    <w:p>
+      <w:pPr>
+        <w:jc w:val="center"/>
+        <w:rPr>
+          <w:lang w:val="en-GB"/>
+        </w:rPr>
+      </w:pPr>
+    </w:p>
+    <w:p>
+      <w:pPr>
+        <w:jc w:val="center"/>
+        <w:rPr>
+          <w:lang w:val="en-GB"/>
+        </w:rPr>
+      </w:pPr>
+    </w:p>
+    <w:p>
+      <w:pPr>
+        <w:jc w:val="center"/>
+        <w:rPr>
+          <w:lang w:val="en-GB"/>
+        </w:rPr>
+      </w:pPr>
+    </w:p>
+    <w:p>
+      <w:pPr>
+        <w:jc w:val="center"/>
+        <w:rPr>
+          <w:lang w:val="en-GB"/>
+        </w:rPr>
+      </w:pPr>
+    </w:p>
+    <w:p>
+      <w:pPr>
+        <w:jc w:val="center"/>
+        <w:rPr>
+          <w:lang w:val="en-GB"/>
+        </w:rPr>
+      </w:pPr>
+    </w:p>
+    <w:p>
+      <w:pPr>
+        <w:jc w:val="center"/>
+        <w:rPr>
+          <w:lang w:val="en-GB"/>
+        </w:rPr>
+      </w:pPr>
+      <w:r>
+        <w:rPr>
+          <w:lang w:val="en-GB"/>
+        </w:rPr>
+        <w:t>End of Paper</w:t>
+      </w:r>
+    </w:p>
     <w:sectPr>
       <w:type w:val="continuous"/>
       <w:pgSz w:w="11906" w:h="16838"/>
@@ -668,28 +1343,28 @@
 <file path=word/numbering.xml><?xml version="1.0" encoding="utf-8"?>
 <w:numbering xmlns:wpc="http://schemas.microsoft.com/office/word/2010/wordprocessingCanvas" xmlns:cx="http://schemas.microsoft.com/office/drawing/2014/chartex" xmlns:cx1="http://schemas.microsoft.com/office/drawing/2015/9/8/chartex" xmlns:cx2="http://schemas.microsoft.com/office/drawing/2015/10/21/chartex" xmlns:cx3="http://schemas.microsoft.com/office/drawing/2016/5/9/chartex" xmlns:cx4="http://schemas.microsoft.com/office/drawing/2016/5/10/chartex" xmlns:cx5="http://schemas.microsoft.com/office/drawing/2016/5/11/chartex" xmlns:cx6="http://schemas.microsoft.com/office/drawing/2016/5/12/chartex" xmlns:cx7="http://schemas.microsoft.com/office/drawing/2016/5/13/chartex" xmlns:cx8="http://schemas.microsoft.com/office/drawing/2016/5/14/chartex" xmlns:mc="http://schemas.openxmlformats.org/markup-compatibility/2006" xmlns:aink="http://schemas.microsoft.com/office/drawing/2016/ink" xmlns:am3d="http://schemas.microsoft.com/office/drawing/2017/model3d" xmlns:o="urn:schemas-microsoft-com:office:office" xmlns:oel="http://schemas.microsoft.com/office/2019/extlst" xmlns:r="http://schemas.openxmlformats.org/officeDocument/2006/relationships" xmlns:m="http://schemas.openxmlformats.org/officeDocument/2006/math" xmlns:v="urn:schemas-microsoft-com:vml" xmlns:wp14="http://schemas.microsoft.com/office/word/2010/wordprocessingDrawing" xmlns:wp="http://schemas.openxmlformats.org/drawingml/2006/wordprocessingDrawing" xmlns:w10="urn:schemas-microsoft-com:office:word" xmlns:w="http://schemas.openxmlformats.org/wordprocessingml/2006/main" xmlns:w14="http://schemas.microsoft.com/office/word/2010/wordml" xmlns:w15="http://schemas.microsoft.com/office/word/2012/wordml" xmlns:w16cex="http://schemas.microsoft.com/office/word/2018/wordml/cex" xmlns:w16cid="http://schemas.microsoft.com/office/word/2016/wordml/cid" xmlns:w16="http://schemas.microsoft.com/office/word/2018/wordml" xmlns:w16du="http://schemas.microsoft.com/office/word/2023/wordml/word16du" xmlns:w16sdtdh="http://schemas.microsoft.com/office/word/2020/wordml/sdtdatahash" xmlns:w16sdtfl="http://schemas.microsoft.com/office/word/2024/wordml/sdtformatlock" xmlns:w16se="http://schemas.microsoft.com/office/word/2015/wordml/symex" xmlns:wpg="http://schemas.microsoft.com/office/word/2010/wordprocessingGroup" xmlns:wpi="http://schemas.microsoft.com/office/word/2010/wordprocessingInk" xmlns:wne="http://schemas.microsoft.com/office/word/2006/wordml" xmlns:wps="http://schemas.microsoft.com/office/word/2010/wordprocessingShape" mc:Ignorable="w14 w15 w16se w16cid w16 w16cex w16sdtdh w16sdtfl w16du wp14">
   <w:abstractNum w:abstractNumId="0" w15:restartNumberingAfterBreak="0">
-    <w:nsid w:val="287D0CA4"/>
+    <w:nsid w:val="1AF14F60"/>
     <w:multiLevelType w:val="hybridMultilevel"/>
-    <w:tmpl w:val="57DC0BE0"/>
-    <w:lvl w:ilvl="0" w:tplc="D19013F8">
-      <w:start w:val="1"/>
-      <w:numFmt w:val="decimal"/>
+    <w:tmpl w:val="768A1F36"/>
+    <w:lvl w:ilvl="0" w:tplc="C638F25C">
+      <w:start w:val="1"/>
+      <w:numFmt w:val="lowerLetter"/>
       <w:lvlText w:val="%1."/>
       <w:lvlJc w:val="left"/>
       <w:pPr>
-        <w:ind w:left="360" w:hanging="360"/>
+        <w:ind w:left="720" w:hanging="360"/>
       </w:pPr>
       <w:rPr>
         <w:rFonts w:hint="default"/>
       </w:rPr>
     </w:lvl>
-    <w:lvl w:ilvl="1" w:tplc="04090019">
+    <w:lvl w:ilvl="1" w:tplc="04090019" w:tentative="1">
       <w:start w:val="1"/>
       <w:numFmt w:val="ideographTraditional"/>
       <w:lvlText w:val="%2、"/>
       <w:lvlJc w:val="left"/>
       <w:pPr>
-        <w:ind w:left="960" w:hanging="480"/>
+        <w:ind w:left="1320" w:hanging="480"/>
       </w:pPr>
     </w:lvl>
     <w:lvl w:ilvl="2" w:tplc="0409001B" w:tentative="1">
@@ -698,7 +1373,7 @@
       <w:lvlText w:val="%3."/>
       <w:lvlJc w:val="right"/>
       <w:pPr>
-        <w:ind w:left="1440" w:hanging="480"/>
+        <w:ind w:left="1800" w:hanging="480"/>
       </w:pPr>
     </w:lvl>
     <w:lvl w:ilvl="3" w:tplc="0409000F" w:tentative="1">
@@ -707,7 +1382,7 @@
       <w:lvlText w:val="%4."/>
       <w:lvlJc w:val="left"/>
       <w:pPr>
-        <w:ind w:left="1920" w:hanging="480"/>
+        <w:ind w:left="2280" w:hanging="480"/>
       </w:pPr>
     </w:lvl>
     <w:lvl w:ilvl="4" w:tplc="04090019" w:tentative="1">
@@ -716,7 +1391,7 @@
       <w:lvlText w:val="%5、"/>
       <w:lvlJc w:val="left"/>
       <w:pPr>
-        <w:ind w:left="2400" w:hanging="480"/>
+        <w:ind w:left="2760" w:hanging="480"/>
       </w:pPr>
     </w:lvl>
     <w:lvl w:ilvl="5" w:tplc="0409001B" w:tentative="1">
@@ -725,7 +1400,7 @@
       <w:lvlText w:val="%6."/>
       <w:lvlJc w:val="right"/>
       <w:pPr>
-        <w:ind w:left="2880" w:hanging="480"/>
+        <w:ind w:left="3240" w:hanging="480"/>
       </w:pPr>
     </w:lvl>
     <w:lvl w:ilvl="6" w:tplc="0409000F" w:tentative="1">
@@ -734,7 +1409,7 @@
       <w:lvlText w:val="%7."/>
       <w:lvlJc w:val="left"/>
       <w:pPr>
-        <w:ind w:left="3360" w:hanging="480"/>
+        <w:ind w:left="3720" w:hanging="480"/>
       </w:pPr>
     </w:lvl>
     <w:lvl w:ilvl="7" w:tplc="04090019" w:tentative="1">
@@ -743,7 +1418,7 @@
       <w:lvlText w:val="%8、"/>
       <w:lvlJc w:val="left"/>
       <w:pPr>
-        <w:ind w:left="3840" w:hanging="480"/>
+        <w:ind w:left="4200" w:hanging="480"/>
       </w:pPr>
     </w:lvl>
     <w:lvl w:ilvl="8" w:tplc="0409001B" w:tentative="1">
@@ -752,11 +1427,189 @@
       <w:lvlText w:val="%9."/>
       <w:lvlJc w:val="right"/>
       <w:pPr>
-        <w:ind w:left="4320" w:hanging="480"/>
+        <w:ind w:left="4680" w:hanging="480"/>
       </w:pPr>
     </w:lvl>
   </w:abstractNum>
   <w:abstractNum w:abstractNumId="1" w15:restartNumberingAfterBreak="0">
+    <w:nsid w:val="1B721A49"/>
+    <w:multiLevelType w:val="hybridMultilevel"/>
+    <w:tmpl w:val="57DC0BE0"/>
+    <w:lvl w:ilvl="0" w:tplc="FFFFFFFF">
+      <w:start w:val="1"/>
+      <w:numFmt w:val="decimal"/>
+      <w:lvlText w:val="%1."/>
+      <w:lvlJc w:val="left"/>
+      <w:pPr>
+        <w:ind w:left="360" w:hanging="360"/>
+      </w:pPr>
+      <w:rPr>
+        <w:rFonts w:hint="default"/>
+      </w:rPr>
+    </w:lvl>
+    <w:lvl w:ilvl="1" w:tplc="FFFFFFFF">
+      <w:start w:val="1"/>
+      <w:numFmt w:val="ideographTraditional"/>
+      <w:lvlText w:val="%2、"/>
+      <w:lvlJc w:val="left"/>
+      <w:pPr>
+        <w:ind w:left="960" w:hanging="480"/>
+      </w:pPr>
+    </w:lvl>
+    <w:lvl w:ilvl="2" w:tplc="FFFFFFFF" w:tentative="1">
+      <w:start w:val="1"/>
+      <w:numFmt w:val="lowerRoman"/>
+      <w:lvlText w:val="%3."/>
+      <w:lvlJc w:val="right"/>
+      <w:pPr>
+        <w:ind w:left="1440" w:hanging="480"/>
+      </w:pPr>
+    </w:lvl>
+    <w:lvl w:ilvl="3" w:tplc="FFFFFFFF" w:tentative="1">
+      <w:start w:val="1"/>
+      <w:numFmt w:val="decimal"/>
+      <w:lvlText w:val="%4."/>
+      <w:lvlJc w:val="left"/>
+      <w:pPr>
+        <w:ind w:left="1920" w:hanging="480"/>
+      </w:pPr>
+    </w:lvl>
+    <w:lvl w:ilvl="4" w:tplc="FFFFFFFF" w:tentative="1">
+      <w:start w:val="1"/>
+      <w:numFmt w:val="ideographTraditional"/>
+      <w:lvlText w:val="%5、"/>
+      <w:lvlJc w:val="left"/>
+      <w:pPr>
+        <w:ind w:left="2400" w:hanging="480"/>
+      </w:pPr>
+    </w:lvl>
+    <w:lvl w:ilvl="5" w:tplc="FFFFFFFF" w:tentative="1">
+      <w:start w:val="1"/>
+      <w:numFmt w:val="lowerRoman"/>
+      <w:lvlText w:val="%6."/>
+      <w:lvlJc w:val="right"/>
+      <w:pPr>
+        <w:ind w:left="2880" w:hanging="480"/>
+      </w:pPr>
+    </w:lvl>
+    <w:lvl w:ilvl="6" w:tplc="FFFFFFFF" w:tentative="1">
+      <w:start w:val="1"/>
+      <w:numFmt w:val="decimal"/>
+      <w:lvlText w:val="%7."/>
+      <w:lvlJc w:val="left"/>
+      <w:pPr>
+        <w:ind w:left="3360" w:hanging="480"/>
+      </w:pPr>
+    </w:lvl>
+    <w:lvl w:ilvl="7" w:tplc="FFFFFFFF" w:tentative="1">
+      <w:start w:val="1"/>
+      <w:numFmt w:val="ideographTraditional"/>
+      <w:lvlText w:val="%8、"/>
+      <w:lvlJc w:val="left"/>
+      <w:pPr>
+        <w:ind w:left="3840" w:hanging="480"/>
+      </w:pPr>
+    </w:lvl>
+    <w:lvl w:ilvl="8" w:tplc="FFFFFFFF" w:tentative="1">
+      <w:start w:val="1"/>
+      <w:numFmt w:val="lowerRoman"/>
+      <w:lvlText w:val="%9."/>
+      <w:lvlJc w:val="right"/>
+      <w:pPr>
+        <w:ind w:left="4320" w:hanging="480"/>
+      </w:pPr>
+    </w:lvl>
+  </w:abstractNum>
+  <w:abstractNum w:abstractNumId="2" w15:restartNumberingAfterBreak="0">
+    <w:nsid w:val="287D0CA4"/>
+    <w:multiLevelType w:val="hybridMultilevel"/>
+    <w:tmpl w:val="C3AE6BF8"/>
+    <w:lvl w:ilvl="0" w:tplc="D19013F8">
+      <w:start w:val="1"/>
+      <w:numFmt w:val="decimal"/>
+      <w:lvlText w:val="%1."/>
+      <w:lvlJc w:val="left"/>
+      <w:pPr>
+        <w:ind w:left="360" w:hanging="360"/>
+      </w:pPr>
+      <w:rPr>
+        <w:rFonts w:hint="default"/>
+      </w:rPr>
+    </w:lvl>
+    <w:lvl w:ilvl="1" w:tplc="04090019">
+      <w:start w:val="1"/>
+      <w:numFmt w:val="ideographTraditional"/>
+      <w:lvlText w:val="%2、"/>
+      <w:lvlJc w:val="left"/>
+      <w:pPr>
+        <w:ind w:left="960" w:hanging="480"/>
+      </w:pPr>
+    </w:lvl>
+    <w:lvl w:ilvl="2" w:tplc="0409001B" w:tentative="1">
+      <w:start w:val="1"/>
+      <w:numFmt w:val="lowerRoman"/>
+      <w:lvlText w:val="%3."/>
+      <w:lvlJc w:val="right"/>
+      <w:pPr>
+        <w:ind w:left="1440" w:hanging="480"/>
+      </w:pPr>
+    </w:lvl>
+    <w:lvl w:ilvl="3" w:tplc="0409000F" w:tentative="1">
+      <w:start w:val="1"/>
+      <w:numFmt w:val="decimal"/>
+      <w:lvlText w:val="%4."/>
+      <w:lvlJc w:val="left"/>
+      <w:pPr>
+        <w:ind w:left="1920" w:hanging="480"/>
+      </w:pPr>
+    </w:lvl>
+    <w:lvl w:ilvl="4" w:tplc="04090019" w:tentative="1">
+      <w:start w:val="1"/>
+      <w:numFmt w:val="ideographTraditional"/>
+      <w:lvlText w:val="%5、"/>
+      <w:lvlJc w:val="left"/>
+      <w:pPr>
+        <w:ind w:left="2400" w:hanging="480"/>
+      </w:pPr>
+    </w:lvl>
+    <w:lvl w:ilvl="5" w:tplc="0409001B" w:tentative="1">
+      <w:start w:val="1"/>
+      <w:numFmt w:val="lowerRoman"/>
+      <w:lvlText w:val="%6."/>
+      <w:lvlJc w:val="right"/>
+      <w:pPr>
+        <w:ind w:left="2880" w:hanging="480"/>
+      </w:pPr>
+    </w:lvl>
+    <w:lvl w:ilvl="6" w:tplc="0409000F" w:tentative="1">
+      <w:start w:val="1"/>
+      <w:numFmt w:val="decimal"/>
+      <w:lvlText w:val="%7."/>
+      <w:lvlJc w:val="left"/>
+      <w:pPr>
+        <w:ind w:left="3360" w:hanging="480"/>
+      </w:pPr>
+    </w:lvl>
+    <w:lvl w:ilvl="7" w:tplc="04090019" w:tentative="1">
+      <w:start w:val="1"/>
+      <w:numFmt w:val="ideographTraditional"/>
+      <w:lvlText w:val="%8、"/>
+      <w:lvlJc w:val="left"/>
+      <w:pPr>
+        <w:ind w:left="3840" w:hanging="480"/>
+      </w:pPr>
+    </w:lvl>
+    <w:lvl w:ilvl="8" w:tplc="0409001B" w:tentative="1">
+      <w:start w:val="1"/>
+      <w:numFmt w:val="lowerRoman"/>
+      <w:lvlText w:val="%9."/>
+      <w:lvlJc w:val="right"/>
+      <w:pPr>
+        <w:ind w:left="4320" w:hanging="480"/>
+      </w:pPr>
+    </w:lvl>
+  </w:abstractNum>
+  <w:abstractNum w:abstractNumId="3" w15:restartNumberingAfterBreak="0">
     <w:nsid w:val="29EA2D15"/>
     <w:multiLevelType w:val="hybridMultilevel"/>
     <w:tmpl w:val="FEAEDFC0"/>
@@ -845,7 +1698,7 @@
       </w:pPr>
     </w:lvl>
   </w:abstractNum>
-  <w:abstractNum w:abstractNumId="2" w15:restartNumberingAfterBreak="0">
+  <w:abstractNum w:abstractNumId="4" w15:restartNumberingAfterBreak="0">
     <w:nsid w:val="2F4B0201"/>
     <w:multiLevelType w:val="hybridMultilevel"/>
     <w:tmpl w:val="2CC00F84"/>
@@ -934,7 +1787,185 @@
       </w:pPr>
     </w:lvl>
   </w:abstractNum>
-  <w:abstractNum w:abstractNumId="3" w15:restartNumberingAfterBreak="0">
+  <w:abstractNum w:abstractNumId="5" w15:restartNumberingAfterBreak="0">
+    <w:nsid w:val="44664EF6"/>
+    <w:multiLevelType w:val="hybridMultilevel"/>
+    <w:tmpl w:val="57DC0BE0"/>
+    <w:lvl w:ilvl="0" w:tplc="FFFFFFFF">
+      <w:start w:val="1"/>
+      <w:numFmt w:val="decimal"/>
+      <w:lvlText w:val="%1."/>
+      <w:lvlJc w:val="left"/>
+      <w:pPr>
+        <w:ind w:left="360" w:hanging="360"/>
+      </w:pPr>
+      <w:rPr>
+        <w:rFonts w:hint="default"/>
+      </w:rPr>
+    </w:lvl>
+    <w:lvl w:ilvl="1" w:tplc="FFFFFFFF">
+      <w:start w:val="1"/>
+      <w:numFmt w:val="ideographTraditional"/>
+      <w:lvlText w:val="%2、"/>
+      <w:lvlJc w:val="left"/>
+      <w:pPr>
+        <w:ind w:left="960" w:hanging="480"/>
+      </w:pPr>
+    </w:lvl>
+    <w:lvl w:ilvl="2" w:tplc="FFFFFFFF" w:tentative="1">
+      <w:start w:val="1"/>
+      <w:numFmt w:val="lowerRoman"/>
+      <w:lvlText w:val="%3."/>
+      <w:lvlJc w:val="right"/>
+      <w:pPr>
+        <w:ind w:left="1440" w:hanging="480"/>
+      </w:pPr>
+    </w:lvl>
+    <w:lvl w:ilvl="3" w:tplc="FFFFFFFF" w:tentative="1">
+      <w:start w:val="1"/>
+      <w:numFmt w:val="decimal"/>
+      <w:lvlText w:val="%4."/>
+      <w:lvlJc w:val="left"/>
+      <w:pPr>
+        <w:ind w:left="1920" w:hanging="480"/>
+      </w:pPr>
+    </w:lvl>
+    <w:lvl w:ilvl="4" w:tplc="FFFFFFFF" w:tentative="1">
+      <w:start w:val="1"/>
+      <w:numFmt w:val="ideographTraditional"/>
+      <w:lvlText w:val="%5、"/>
+      <w:lvlJc w:val="left"/>
+      <w:pPr>
+        <w:ind w:left="2400" w:hanging="480"/>
+      </w:pPr>
+    </w:lvl>
+    <w:lvl w:ilvl="5" w:tplc="FFFFFFFF" w:tentative="1">
+      <w:start w:val="1"/>
+      <w:numFmt w:val="lowerRoman"/>
+      <w:lvlText w:val="%6."/>
+      <w:lvlJc w:val="right"/>
+      <w:pPr>
+        <w:ind w:left="2880" w:hanging="480"/>
+      </w:pPr>
+    </w:lvl>
+    <w:lvl w:ilvl="6" w:tplc="FFFFFFFF" w:tentative="1">
+      <w:start w:val="1"/>
+      <w:numFmt w:val="decimal"/>
+      <w:lvlText w:val="%7."/>
+      <w:lvlJc w:val="left"/>
+      <w:pPr>
+        <w:ind w:left="3360" w:hanging="480"/>
+      </w:pPr>
+    </w:lvl>
+    <w:lvl w:ilvl="7" w:tplc="FFFFFFFF" w:tentative="1">
+      <w:start w:val="1"/>
+      <w:numFmt w:val="ideographTraditional"/>
+      <w:lvlText w:val="%8、"/>
+      <w:lvlJc w:val="left"/>
+      <w:pPr>
+        <w:ind w:left="3840" w:hanging="480"/>
+      </w:pPr>
+    </w:lvl>
+    <w:lvl w:ilvl="8" w:tplc="FFFFFFFF" w:tentative="1">
+      <w:start w:val="1"/>
+      <w:numFmt w:val="lowerRoman"/>
+      <w:lvlText w:val="%9."/>
+      <w:lvlJc w:val="right"/>
+      <w:pPr>
+        <w:ind w:left="4320" w:hanging="480"/>
+      </w:pPr>
+    </w:lvl>
+  </w:abstractNum>
+  <w:abstractNum w:abstractNumId="6" w15:restartNumberingAfterBreak="0">
+    <w:nsid w:val="4D822AAE"/>
+    <w:multiLevelType w:val="hybridMultilevel"/>
+    <w:tmpl w:val="A78414C0"/>
+    <w:lvl w:ilvl="0" w:tplc="DDDCC4A6">
+      <w:start w:val="1"/>
+      <w:numFmt w:val="lowerLetter"/>
+      <w:lvlText w:val="%1."/>
+      <w:lvlJc w:val="left"/>
+      <w:pPr>
+        <w:ind w:left="720" w:hanging="360"/>
+      </w:pPr>
+      <w:rPr>
+        <w:rFonts w:hint="default"/>
+      </w:rPr>
+    </w:lvl>
+    <w:lvl w:ilvl="1" w:tplc="04090019" w:tentative="1">
+      <w:start w:val="1"/>
+      <w:numFmt w:val="ideographTraditional"/>
+      <w:lvlText w:val="%2、"/>
+      <w:lvlJc w:val="left"/>
+      <w:pPr>
+        <w:ind w:left="1320" w:hanging="480"/>
+      </w:pPr>
+    </w:lvl>
+    <w:lvl w:ilvl="2" w:tplc="0409001B" w:tentative="1">
+      <w:start w:val="1"/>
+      <w:numFmt w:val="lowerRoman"/>
+      <w:lvlText w:val="%3."/>
+      <w:lvlJc w:val="right"/>
+      <w:pPr>
+        <w:ind w:left="1800" w:hanging="480"/>
+      </w:pPr>
+    </w:lvl>
+    <w:lvl w:ilvl="3" w:tplc="0409000F" w:tentative="1">
+      <w:start w:val="1"/>
+      <w:numFmt w:val="decimal"/>
+      <w:lvlText w:val="%4."/>
+      <w:lvlJc w:val="left"/>
+      <w:pPr>
+        <w:ind w:left="2280" w:hanging="480"/>
+      </w:pPr>
+    </w:lvl>
+    <w:lvl w:ilvl="4" w:tplc="04090019" w:tentative="1">
+      <w:start w:val="1"/>
+      <w:numFmt w:val="ideographTraditional"/>
+      <w:lvlText w:val="%5、"/>
+      <w:lvlJc w:val="left"/>
+      <w:pPr>
+        <w:ind w:left="2760" w:hanging="480"/>
+      </w:pPr>
+    </w:lvl>
+    <w:lvl w:ilvl="5" w:tplc="0409001B" w:tentative="1">
+      <w:start w:val="1"/>
+      <w:numFmt w:val="lowerRoman"/>
+      <w:lvlText w:val="%6."/>
+      <w:lvlJc w:val="right"/>
+      <w:pPr>
+        <w:ind w:left="3240" w:hanging="480"/>
+      </w:pPr>
+    </w:lvl>
+    <w:lvl w:ilvl="6" w:tplc="0409000F" w:tentative="1">
+      <w:start w:val="1"/>
+      <w:numFmt w:val="decimal"/>
+      <w:lvlText w:val="%7."/>
+      <w:lvlJc w:val="left"/>
+      <w:pPr>
+        <w:ind w:left="3720" w:hanging="480"/>
+      </w:pPr>
+    </w:lvl>
+    <w:lvl w:ilvl="7" w:tplc="04090019" w:tentative="1">
+      <w:start w:val="1"/>
+      <w:numFmt w:val="ideographTraditional"/>
+      <w:lvlText w:val="%8、"/>
+      <w:lvlJc w:val="left"/>
+      <w:pPr>
+        <w:ind w:left="4200" w:hanging="480"/>
+      </w:pPr>
+    </w:lvl>
+    <w:lvl w:ilvl="8" w:tplc="0409001B" w:tentative="1">
+      <w:start w:val="1"/>
+      <w:numFmt w:val="lowerRoman"/>
+      <w:lvlText w:val="%9."/>
+      <w:lvlJc w:val="right"/>
+      <w:pPr>
+        <w:ind w:left="4680" w:hanging="480"/>
+      </w:pPr>
+    </w:lvl>
+  </w:abstractNum>
+  <w:abstractNum w:abstractNumId="7" w15:restartNumberingAfterBreak="0">
     <w:nsid w:val="5F870C34"/>
     <w:multiLevelType w:val="hybridMultilevel"/>
     <w:tmpl w:val="A48622A4"/>
@@ -1023,7 +2054,7 @@
       </w:pPr>
     </w:lvl>
   </w:abstractNum>
-  <w:abstractNum w:abstractNumId="4" w15:restartNumberingAfterBreak="0">
+  <w:abstractNum w:abstractNumId="8" w15:restartNumberingAfterBreak="0">
     <w:nsid w:val="76B55519"/>
     <w:multiLevelType w:val="hybridMultilevel"/>
     <w:tmpl w:val="82A2F19E"/>
@@ -1113,19 +2144,31 @@
     </w:lvl>
   </w:abstractNum>
   <w:num w:numId="1" w16cid:durableId="1085566048">
-    <w:abstractNumId w:val="0"/>
+    <w:abstractNumId w:val="2"/>
   </w:num>
   <w:num w:numId="2" w16cid:durableId="897669517">
-    <w:abstractNumId w:val="2"/>
+    <w:abstractNumId w:val="4"/>
   </w:num>
   <w:num w:numId="3" w16cid:durableId="1435323859">
+    <w:abstractNumId w:val="3"/>
+  </w:num>
+  <w:num w:numId="4" w16cid:durableId="2131701398">
+    <w:abstractNumId w:val="8"/>
+  </w:num>
+  <w:num w:numId="5" w16cid:durableId="241450417">
+    <w:abstractNumId w:val="7"/>
+  </w:num>
+  <w:num w:numId="6" w16cid:durableId="1799685964">
+    <w:abstractNumId w:val="5"/>
+  </w:num>
+  <w:num w:numId="7" w16cid:durableId="567422707">
     <w:abstractNumId w:val="1"/>
   </w:num>
-  <w:num w:numId="4" w16cid:durableId="2131701398">
-    <w:abstractNumId w:val="4"/>
+  <w:num w:numId="8" w16cid:durableId="958879071">
+    <w:abstractNumId w:val="6"/>
   </w:num>
-  <w:num w:numId="5" w16cid:durableId="241450417">
-    <w:abstractNumId w:val="3"/>
+  <w:num w:numId="9" w16cid:durableId="1201406604">
+    <w:abstractNumId w:val="0"/>
   </w:num>
 </w:numbering>
 </file>
@@ -2057,6 +3100,25 @@
       <w:color w:val="666666"/>
     </w:rPr>
   </w:style>
+  <w:style w:type="table" w:styleId="TableGrid">
+    <w:name w:val="Table Grid"/>
+    <w:basedOn w:val="TableNormal"/>
+    <w:uiPriority w:val="39"/>
+    <w:rsid w:val="00A13F94"/>
+    <w:pPr>
+      <w:spacing w:after="0" w:line="240" w:lineRule="auto"/>
+    </w:pPr>
+    <w:tblPr>
+      <w:tblBorders>
+        <w:top w:val="single" w:sz="4" w:space="0" w:color="auto"/>
+        <w:left w:val="single" w:sz="4" w:space="0" w:color="auto"/>
+        <w:bottom w:val="single" w:sz="4" w:space="0" w:color="auto"/>
+        <w:right w:val="single" w:sz="4" w:space="0" w:color="auto"/>
+        <w:insideH w:val="single" w:sz="4" w:space="0" w:color="auto"/>
+        <w:insideV w:val="single" w:sz="4" w:space="0" w:color="auto"/>
+      </w:tblBorders>
+    </w:tblPr>
+  </w:style>
 </w:styles>
 </file>
 

</xml_diff>